<commit_message>
understand how stage works
</commit_message>
<xml_diff>
--- a/readme.docx
+++ b/readme.docx
@@ -89,16 +89,39 @@
           <w:rFonts w:hint="eastAsia"/>
           <w:lang w:val="en-US" w:eastAsia="zh-CN"/>
         </w:rPr>
-        <w:t>中雨,今天是农历五月初五,中国传统节日:端午节,这一天我们要吃粽子了,</w:t>
+        <w:t>中雨,今天是农历五月初五,中国传统节日:端午节,这一天我们要吃粽子了,赛龙舟</w:t>
       </w:r>
       <w:bookmarkStart w:id="0" w:name="_GoBack"/>
       <w:bookmarkEnd w:id="0"/>
-      <w:r>
-        <w:rPr>
-          <w:rFonts w:hint="eastAsia"/>
-          <w:lang w:val="en-US" w:eastAsia="zh-CN"/>
-        </w:rPr>
-        <w:t>赛龙舟</w:t>
+    </w:p>
+    <w:p>
+      <w:pPr>
+        <w:rPr>
+          <w:rFonts w:hint="default"/>
+          <w:lang w:val="en-US" w:eastAsia="zh-CN"/>
+        </w:rPr>
+      </w:pPr>
+      <w:r>
+        <w:rPr>
+          <w:rFonts w:hint="default"/>
+          <w:lang w:val="en-US" w:eastAsia="zh-CN"/>
+        </w:rPr>
+        <w:t>2022年6月7日星期二</w:t>
+      </w:r>
+    </w:p>
+    <w:p>
+      <w:pPr>
+        <w:rPr>
+          <w:rFonts w:hint="default"/>
+          <w:lang w:val="en-US" w:eastAsia="zh-CN"/>
+        </w:rPr>
+      </w:pPr>
+      <w:r>
+        <w:rPr>
+          <w:rFonts w:hint="default"/>
+          <w:lang w:val="en-US" w:eastAsia="zh-CN"/>
+        </w:rPr>
+        <w:t>晴,今天是高考第一天,上午考语文,下午考数学。</w:t>
       </w:r>
     </w:p>
     <w:sectPr>
@@ -225,7 +248,7 @@
     <w:lsdException w:unhideWhenUsed="0" w:uiPriority="0" w:semiHidden="0" w:name="HTML Sample"/>
     <w:lsdException w:unhideWhenUsed="0" w:uiPriority="0" w:semiHidden="0" w:name="HTML Typewriter"/>
     <w:lsdException w:unhideWhenUsed="0" w:uiPriority="0" w:semiHidden="0" w:name="HTML Variable"/>
-    <w:lsdException w:unhideWhenUsed="0" w:uiPriority="0" w:name="Normal Table"/>
+    <w:lsdException w:qFormat="1" w:unhideWhenUsed="0" w:uiPriority="0" w:name="Normal Table"/>
     <w:lsdException w:unhideWhenUsed="0" w:uiPriority="0" w:semiHidden="0" w:name="annotation subject"/>
     <w:lsdException w:unhideWhenUsed="0" w:uiPriority="0" w:semiHidden="0" w:name="Table Simple 1"/>
     <w:lsdException w:unhideWhenUsed="0" w:uiPriority="0" w:semiHidden="0" w:name="Table Simple 2"/>
@@ -396,6 +419,7 @@
   <w:style w:type="table" w:default="1" w:styleId="2">
     <w:name w:val="Normal Table"/>
     <w:semiHidden/>
+    <w:qFormat/>
     <w:uiPriority w:val="0"/>
     <w:tblPr>
       <w:tblCellMar>

</xml_diff>

<commit_message>
add words in June 7th second
</commit_message>
<xml_diff>
--- a/readme.docx
+++ b/readme.docx
@@ -91,8 +91,6 @@
         </w:rPr>
         <w:t>中雨,今天是农历五月初五,中国传统节日:端午节,这一天我们要吃粽子了,赛龙舟</w:t>
       </w:r>
-      <w:bookmarkStart w:id="0" w:name="_GoBack"/>
-      <w:bookmarkEnd w:id="0"/>
     </w:p>
     <w:p>
       <w:pPr>
@@ -121,7 +119,30 @@
           <w:rFonts w:hint="default"/>
           <w:lang w:val="en-US" w:eastAsia="zh-CN"/>
         </w:rPr>
-        <w:t>晴,今天是高考第一天,上午考语文,下午考数学。</w:t>
+        <w:t>晴,今天是高考第一天,上午考语文,下午考数学</w:t>
+      </w:r>
+      <w:r>
+        <w:rPr>
+          <w:rFonts w:hint="eastAsia"/>
+          <w:lang w:val="en-US" w:eastAsia="zh-CN"/>
+        </w:rPr>
+        <w:t>,天气</w:t>
+      </w:r>
+      <w:bookmarkStart w:id="0" w:name="_GoBack"/>
+      <w:bookmarkEnd w:id="0"/>
+      <w:r>
+        <w:rPr>
+          <w:rFonts w:hint="eastAsia"/>
+          <w:lang w:val="en-US" w:eastAsia="zh-CN"/>
+        </w:rPr>
+        <w:t>真不错,心情也很好</w:t>
+      </w:r>
+      <w:r>
+        <w:rPr>
+          <w:rFonts w:hint="default"/>
+          <w:lang w:val="en-US" w:eastAsia="zh-CN"/>
+        </w:rPr>
+        <w:t>。</w:t>
       </w:r>
     </w:p>
     <w:sectPr>

</xml_diff>

<commit_message>
add simple and quick
</commit_message>
<xml_diff>
--- a/readme.docx
+++ b/readme.docx
@@ -9,6 +9,7 @@
           <w:lang w:val="en-US" w:eastAsia="zh-CN"/>
         </w:rPr>
       </w:pPr>
+      <w:bookmarkStart w:id="0" w:name="_GoBack"/>
       <w:r>
         <w:rPr>
           <w:rFonts w:hint="eastAsia"/>
@@ -17,6 +18,7 @@
         <w:t>2022年6月1日星期三</w:t>
       </w:r>
     </w:p>
+    <w:bookmarkEnd w:id="0"/>
     <w:p>
       <w:pPr>
         <w:rPr>
@@ -163,10 +165,8 @@
           <w:rFonts w:hint="eastAsia"/>
           <w:lang w:val="en-US" w:eastAsia="zh-CN"/>
         </w:rPr>
-        <w:t>多云转小雨，今天学习了分支管理，创建了一个dev分支。</w:t>
-      </w:r>
-      <w:bookmarkStart w:id="0" w:name="_GoBack"/>
-      <w:bookmarkEnd w:id="0"/>
+        <w:t>多云转小于，今天学习了分支管理，创建了一个dev分支。</w:t>
+      </w:r>
     </w:p>
     <w:sectPr>
       <w:pgSz w:w="11906" w:h="16838"/>

</xml_diff>